<commit_message>
feat: add FORTUNEI templates (10 docs) cleaned with placeholders + enable in API
</commit_message>
<xml_diff>
--- a/public/templates-clean/cetinei/11. Anexa 9 - Suspendarea contractului.docx
+++ b/public/templates-clean/cetinei/11. Anexa 9 - Suspendarea contractului.docx
@@ -4369,17 +4369,17 @@
           <w:kern w:val="0"/>
           <w14:ligatures w14:val="none"/>
         </w:rPr>
-        <w:t>18.</w:t>
-      </w:r>
-      <w:r>
-        <w:rPr>
-          <w:rFonts w:ascii="Times New Roman" w:eastAsia="Times New Roman" w:hAnsi="Times New Roman" w:cs="Times New Roman"/>
-          <w:b/>
-          <w:bCs/>
-          <w:kern w:val="0"/>
-          <w14:ligatures w14:val="none"/>
-        </w:rPr>
-        <w:t>03.2026</w:t>
+        <w:t>{DATA_CONTRACT}</w:t>
+      </w:r>
+      <w:r>
+        <w:rPr>
+          <w:rFonts w:ascii="Times New Roman" w:eastAsia="Times New Roman" w:hAnsi="Times New Roman" w:cs="Times New Roman"/>
+          <w:b/>
+          <w:bCs/>
+          <w:kern w:val="0"/>
+          <w14:ligatures w14:val="none"/>
+        </w:rPr>
+        <w:t/>
       </w:r>
     </w:p>
     <w:p>

</xml_diff>